<commit_message>
feat: mature remediation coverage and submission plan
</commit_message>
<xml_diff>
--- a/portal_materials/NIS2_emberi_dontesi_dokumentumjegyzek.docx
+++ b/portal_materials/NIS2_emberi_dontesi_dokumentumjegyzek.docx
@@ -3630,6 +3630,103 @@
           </w:p>
         </w:tc>
       </w:tr>
+      <w:tr>
+        <w:trPr>
+          <w:cantSplit/>
+        </w:trPr>
+        <w:tc>
+          <w:tcPr>
+            <w:tcW w:type="dxa" w:w="900"/>
+            <w:vAlign w:val="center"/>
+            <w:tcMar>
+              <w:top w:w="80" w:type="dxa"/>
+              <w:bottom w:w="80" w:type="dxa"/>
+              <w:start w:w="120" w:type="dxa"/>
+              <w:end w:w="120" w:type="dxa"/>
+            </w:tcMar>
+          </w:tcPr>
+          <w:p>
+            <w:r>
+              <w:rPr>
+                <w:rFonts w:ascii="Calibri" w:hAnsi="Calibri"/>
+                <w:b w:val="0"/>
+                <w:color w:val="000000"/>
+                <w:sz w:val="18"/>
+              </w:rPr>
+              <w:t>DEF-039</w:t>
+            </w:r>
+          </w:p>
+        </w:tc>
+        <w:tc>
+          <w:tcPr>
+            <w:tcW w:type="dxa" w:w="3000"/>
+            <w:vAlign w:val="center"/>
+            <w:tcMar>
+              <w:top w:w="80" w:type="dxa"/>
+              <w:bottom w:w="80" w:type="dxa"/>
+              <w:start w:w="120" w:type="dxa"/>
+              <w:end w:w="120" w:type="dxa"/>
+            </w:tcMar>
+          </w:tcPr>
+          <w:p>
+            <w:r>
+              <w:rPr>
+                <w:rFonts w:ascii="Calibri" w:hAnsi="Calibri"/>
+                <w:b w:val="0"/>
+                <w:color w:val="000000"/>
+                <w:sz w:val="18"/>
+              </w:rPr>
+              <w:t>Lefedettségpótló akciók szakmai és határidő-jóváhagyása</w:t>
+            </w:r>
+          </w:p>
+        </w:tc>
+        <w:tc>
+          <w:tcPr>
+            <w:tcW w:type="dxa" w:w="2700"/>
+            <w:vAlign w:val="center"/>
+            <w:tcMar>
+              <w:top w:w="80" w:type="dxa"/>
+              <w:bottom w:w="80" w:type="dxa"/>
+              <w:start w:w="120" w:type="dxa"/>
+              <w:end w:w="120" w:type="dxa"/>
+            </w:tcMar>
+          </w:tcPr>
+          <w:p>
+            <w:r>
+              <w:rPr>
+                <w:rFonts w:ascii="Calibri" w:hAnsi="Calibri"/>
+                <w:b w:val="0"/>
+                <w:color w:val="000000"/>
+                <w:sz w:val="18"/>
+              </w:rPr>
+              <w:t>Pásztor András; javasolt kontrollgazdák</w:t>
+            </w:r>
+          </w:p>
+        </w:tc>
+        <w:tc>
+          <w:tcPr>
+            <w:tcW w:type="dxa" w:w="2760"/>
+            <w:vAlign w:val="center"/>
+            <w:tcMar>
+              <w:top w:w="80" w:type="dxa"/>
+              <w:bottom w:w="80" w:type="dxa"/>
+              <w:start w:w="120" w:type="dxa"/>
+              <w:end w:w="120" w:type="dxa"/>
+            </w:tcMar>
+          </w:tcPr>
+          <w:p>
+            <w:r>
+              <w:rPr>
+                <w:rFonts w:ascii="Calibri" w:hAnsi="Calibri"/>
+                <w:b w:val="0"/>
+                <w:color w:val="000000"/>
+                <w:sz w:val="18"/>
+              </w:rPr>
+              <w:t>Lángi Zoltán; Dr. Berta Brigitta; érintett G1/G3/G4 reviewer</w:t>
+            </w:r>
+          </w:p>
+        </w:tc>
+      </w:tr>
     </w:tbl>
     <w:p>
       <w:pPr>
@@ -4359,6 +4456,26 @@
         <w:t>DEF-038_tobbfelhasznalos_portalpilot_inditasi_dontese.docx · SHA-256: f11e97c5c04a0195de00f062e53acba41315e3a64732062d78fc5b1420393d19</w:t>
       </w:r>
     </w:p>
+    <w:p>
+      <w:r>
+        <w:rPr>
+          <w:rFonts w:ascii="Calibri" w:hAnsi="Calibri"/>
+          <w:b/>
+          <w:color w:val="000000"/>
+          <w:sz w:val="22"/>
+        </w:rPr>
+        <w:t xml:space="preserve">DEF-039: </w:t>
+      </w:r>
+      <w:r>
+        <w:rPr>
+          <w:rFonts w:ascii="Calibri" w:hAnsi="Calibri"/>
+          <w:b w:val="0"/>
+          <w:color w:val="000000"/>
+          <w:sz w:val="16"/>
+        </w:rPr>
+        <w:t>DEF-039_lefedettsegpotlo_akciok_szakmai_es_hatarido_jovahagyasa.docx · SHA-256: 1c3d4b4fcad382773b582f80b64ae5b51f0395a2561772d79ea5394273918861</w:t>
+      </w:r>
+    </w:p>
     <w:sectPr>
       <w:footerReference w:type="default" r:id="rId9"/>
       <w:pgSz w:w="12240" w:h="15840"/>

</xml_diff>